<commit_message>
📚 docs: Realização dos levantamentos de requisitos funcionais e não funcionais
</commit_message>
<xml_diff>
--- a/documentation/Sprint01_Task001_Analise.docx
+++ b/documentation/Sprint01_Task001_Analise.docx
@@ -147,6 +147,15 @@
               </w:rPr>
               <w:t>01</w:t>
             </w:r>
+            <w:r>
+              <w:rPr>
+                <w:b/>
+                <w:bCs/>
+              </w:rPr>
+              <w:t xml:space="preserve"> </w:t>
+            </w:r>
+            <w:bookmarkStart w:id="0" w:name="_GoBack"/>
+            <w:bookmarkEnd w:id="0"/>
           </w:p>
         </w:tc>
         <w:tc>
@@ -792,37 +801,80 @@
             <w:tcW w:w="1441" w:type="dxa"/>
           </w:tcPr>
           <w:p>
-            <w:proofErr w:type="spellStart"/>
-            <w:r>
-              <w:t>Adryan</w:t>
-            </w:r>
-            <w:proofErr w:type="spellEnd"/>
-            <w:r>
-              <w:t xml:space="preserve"> </w:t>
-            </w:r>
-          </w:p>
-          <w:p>
-            <w:r>
+            <w:pPr>
+              <w:rPr>
+                <w:lang w:val="en-US"/>
+              </w:rPr>
+            </w:pPr>
+            <w:r>
+              <w:rPr>
+                <w:lang w:val="en-US"/>
+              </w:rPr>
+              <w:t xml:space="preserve">Adryan </w:t>
+            </w:r>
+          </w:p>
+          <w:p>
+            <w:pPr>
+              <w:rPr>
+                <w:lang w:val="en-US"/>
+              </w:rPr>
+            </w:pPr>
+            <w:r>
+              <w:rPr>
+                <w:lang w:val="en-US"/>
+              </w:rPr>
               <w:t>Enzo</w:t>
             </w:r>
           </w:p>
           <w:p>
-            <w:r>
+            <w:pPr>
+              <w:rPr>
+                <w:lang w:val="en-US"/>
+              </w:rPr>
+            </w:pPr>
+            <w:r>
+              <w:rPr>
+                <w:lang w:val="en-US"/>
+              </w:rPr>
               <w:t>Gabriel</w:t>
             </w:r>
           </w:p>
           <w:p>
-            <w:r>
+            <w:pPr>
+              <w:rPr>
+                <w:lang w:val="en-US"/>
+              </w:rPr>
+            </w:pPr>
+            <w:r>
+              <w:rPr>
+                <w:lang w:val="en-US"/>
+              </w:rPr>
               <w:t>Giovanni</w:t>
             </w:r>
           </w:p>
           <w:p>
-            <w:r>
+            <w:pPr>
+              <w:rPr>
+                <w:lang w:val="en-US"/>
+              </w:rPr>
+            </w:pPr>
+            <w:r>
+              <w:rPr>
+                <w:lang w:val="en-US"/>
+              </w:rPr>
               <w:t>Guilherme</w:t>
             </w:r>
           </w:p>
           <w:p>
-            <w:r>
+            <w:pPr>
+              <w:rPr>
+                <w:lang w:val="en-US"/>
+              </w:rPr>
+            </w:pPr>
+            <w:r>
+              <w:rPr>
+                <w:lang w:val="en-US"/>
+              </w:rPr>
               <w:t>Wendell</w:t>
             </w:r>
           </w:p>
@@ -864,10 +916,7 @@
         </w:tc>
       </w:tr>
     </w:tbl>
-    <w:p>
-      <w:bookmarkStart w:id="0" w:name="_GoBack"/>
-      <w:bookmarkEnd w:id="0"/>
-    </w:p>
+    <w:p/>
     <w:p>
       <w:pPr>
         <w:shd w:val="clear" w:color="auto" w:fill="000000" w:themeFill="text1"/>

</xml_diff>